<commit_message>
Add email draft and project submission files for Rooftop Escape assignment
</commit_message>
<xml_diff>
--- a/_submission/04_Feedback/Rooftop_Escape_Feedback_Report.docx
+++ b/_submission/04_Feedback/Rooftop_Escape_Feedback_Report.docx
@@ -4838,7 +4838,7 @@
                 <w:sz w:val="18"/>
                 <w:szCs w:val="18"/>
               </w:rPr>
-              <w:t xml:space="preserve">Floor arrows pointed the wrong way; doorways kept clear of loot</w:t>
+              <w:t xml:space="preserve">Floor arrows and the stairwell sign pointed the wrong way; overlapping signs fixed; doorways kept clear of loot</w:t>
             </w:r>
           </w:p>
         </w:tc>
@@ -4884,7 +4884,7 @@
                 <w:sz w:val="18"/>
                 <w:szCs w:val="18"/>
               </w:rPr>
-              <w:t xml:space="preserve">earlier sprint</w:t>
+              <w:t xml:space="preserve">8065279, 8330792</w:t>
             </w:r>
           </w:p>
         </w:tc>

</xml_diff>

<commit_message>
Add follow-up email with corrected feedback report attachment
</commit_message>
<xml_diff>
--- a/_submission/04_Feedback/Rooftop_Escape_Feedback_Report.docx
+++ b/_submission/04_Feedback/Rooftop_Escape_Feedback_Report.docx
@@ -1305,7 +1305,7 @@
       <w:r>
         <w:drawing>
           <wp:inline distT="0" distB="0" distL="0" distR="0">
-            <wp:extent cx="4791075" cy="4476750"/>
+            <wp:extent cx="5715000" cy="5343525"/>
             <wp:effectExtent t="0" r="0" b="0" l="0"/>
             <wp:docPr id="1" name="" descr="" title=""/>
             <wp:cNvGraphicFramePr>
@@ -1330,7 +1330,7 @@
                   <pic:spPr bwMode="auto">
                     <a:xfrm>
                       <a:off x="0" y="0"/>
-                      <a:ext cx="4791075" cy="4476750"/>
+                      <a:ext cx="5715000" cy="5343525"/>
                     </a:xfrm>
                     <a:prstGeom prst="rect">
                       <a:avLst/>
@@ -1467,7 +1467,7 @@
       <w:r>
         <w:drawing>
           <wp:inline distT="0" distB="0" distL="0" distR="0">
-            <wp:extent cx="5105400" cy="4476750"/>
+            <wp:extent cx="5715000" cy="5010150"/>
             <wp:effectExtent t="0" r="0" b="0" l="0"/>
             <wp:docPr id="1" name="" descr="" title=""/>
             <wp:cNvGraphicFramePr>
@@ -1492,7 +1492,7 @@
                   <pic:spPr bwMode="auto">
                     <a:xfrm>
                       <a:off x="0" y="0"/>
-                      <a:ext cx="5105400" cy="4476750"/>
+                      <a:ext cx="5715000" cy="5010150"/>
                     </a:xfrm>
                     <a:prstGeom prst="rect">
                       <a:avLst/>
@@ -1608,7 +1608,7 @@
       <w:r>
         <w:drawing>
           <wp:inline distT="0" distB="0" distL="0" distR="0">
-            <wp:extent cx="5295900" cy="2752725"/>
+            <wp:extent cx="5715000" cy="2971800"/>
             <wp:effectExtent t="0" r="0" b="0" l="0"/>
             <wp:docPr id="1" name="" descr="" title=""/>
             <wp:cNvGraphicFramePr>
@@ -1633,7 +1633,7 @@
                   <pic:spPr bwMode="auto">
                     <a:xfrm>
                       <a:off x="0" y="0"/>
-                      <a:ext cx="5295900" cy="2752725"/>
+                      <a:ext cx="5715000" cy="2971800"/>
                     </a:xfrm>
                     <a:prstGeom prst="rect">
                       <a:avLst/>
@@ -1749,7 +1749,7 @@
       <w:r>
         <w:drawing>
           <wp:inline distT="0" distB="0" distL="0" distR="0">
-            <wp:extent cx="0" cy="4476750"/>
+            <wp:extent cx="5715000" cy="2276475"/>
             <wp:effectExtent t="0" r="0" b="0" l="0"/>
             <wp:docPr id="1" name="" descr="" title=""/>
             <wp:cNvGraphicFramePr>
@@ -1774,7 +1774,7 @@
                   <pic:spPr bwMode="auto">
                     <a:xfrm>
                       <a:off x="0" y="0"/>
-                      <a:ext cx="0" cy="4476750"/>
+                      <a:ext cx="5715000" cy="2276475"/>
                     </a:xfrm>
                     <a:prstGeom prst="rect">
                       <a:avLst/>
@@ -1911,7 +1911,7 @@
       <w:r>
         <w:drawing>
           <wp:inline distT="0" distB="0" distL="0" distR="0">
-            <wp:extent cx="0" cy="4476750"/>
+            <wp:extent cx="2809875" cy="6096000"/>
             <wp:effectExtent t="0" r="0" b="0" l="0"/>
             <wp:docPr id="1" name="" descr="" title=""/>
             <wp:cNvGraphicFramePr>
@@ -1936,7 +1936,7 @@
                   <pic:spPr bwMode="auto">
                     <a:xfrm>
                       <a:off x="0" y="0"/>
-                      <a:ext cx="0" cy="4476750"/>
+                      <a:ext cx="2809875" cy="6096000"/>
                     </a:xfrm>
                     <a:prstGeom prst="rect">
                       <a:avLst/>
@@ -2073,7 +2073,7 @@
       <w:r>
         <w:drawing>
           <wp:inline distT="0" distB="0" distL="0" distR="0">
-            <wp:extent cx="0" cy="4476750"/>
+            <wp:extent cx="2809875" cy="6096000"/>
             <wp:effectExtent t="0" r="0" b="0" l="0"/>
             <wp:docPr id="1" name="" descr="" title=""/>
             <wp:cNvGraphicFramePr>
@@ -2098,7 +2098,7 @@
                   <pic:spPr bwMode="auto">
                     <a:xfrm>
                       <a:off x="0" y="0"/>
-                      <a:ext cx="0" cy="4476750"/>
+                      <a:ext cx="2809875" cy="6096000"/>
                     </a:xfrm>
                     <a:prstGeom prst="rect">
                       <a:avLst/>
@@ -2235,7 +2235,7 @@
       <w:r>
         <w:drawing>
           <wp:inline distT="0" distB="0" distL="0" distR="0">
-            <wp:extent cx="0" cy="4476750"/>
+            <wp:extent cx="2809875" cy="6096000"/>
             <wp:effectExtent t="0" r="0" b="0" l="0"/>
             <wp:docPr id="1" name="" descr="" title=""/>
             <wp:cNvGraphicFramePr>
@@ -2260,7 +2260,7 @@
                   <pic:spPr bwMode="auto">
                     <a:xfrm>
                       <a:off x="0" y="0"/>
-                      <a:ext cx="0" cy="4476750"/>
+                      <a:ext cx="2809875" cy="6096000"/>
                     </a:xfrm>
                     <a:prstGeom prst="rect">
                       <a:avLst/>
@@ -2397,7 +2397,7 @@
       <w:r>
         <w:drawing>
           <wp:inline distT="0" distB="0" distL="0" distR="0">
-            <wp:extent cx="4467225" cy="4476750"/>
+            <wp:extent cx="5715000" cy="5724525"/>
             <wp:effectExtent t="0" r="0" b="0" l="0"/>
             <wp:docPr id="1" name="" descr="" title=""/>
             <wp:cNvGraphicFramePr>
@@ -2422,7 +2422,7 @@
                   <pic:spPr bwMode="auto">
                     <a:xfrm>
                       <a:off x="0" y="0"/>
-                      <a:ext cx="4467225" cy="4476750"/>
+                      <a:ext cx="5715000" cy="5724525"/>
                     </a:xfrm>
                     <a:prstGeom prst="rect">
                       <a:avLst/>
@@ -2700,7 +2700,7 @@
       <w:r>
         <w:drawing>
           <wp:inline distT="0" distB="0" distL="0" distR="0">
-            <wp:extent cx="0" cy="4476750"/>
+            <wp:extent cx="5715000" cy="3219450"/>
             <wp:effectExtent t="0" r="0" b="0" l="0"/>
             <wp:docPr id="1" name="" descr="" title=""/>
             <wp:cNvGraphicFramePr>
@@ -2725,7 +2725,7 @@
                   <pic:spPr bwMode="auto">
                     <a:xfrm>
                       <a:off x="0" y="0"/>
-                      <a:ext cx="0" cy="4476750"/>
+                      <a:ext cx="5715000" cy="3219450"/>
                     </a:xfrm>
                     <a:prstGeom prst="rect">
                       <a:avLst/>
@@ -3086,7 +3086,7 @@
       <w:r>
         <w:drawing>
           <wp:inline distT="0" distB="0" distL="0" distR="0">
-            <wp:extent cx="0" cy="4476750"/>
+            <wp:extent cx="2809875" cy="6096000"/>
             <wp:effectExtent t="0" r="0" b="0" l="0"/>
             <wp:docPr id="1" name="" descr="" title=""/>
             <wp:cNvGraphicFramePr>
@@ -3111,7 +3111,7 @@
                   <pic:spPr bwMode="auto">
                     <a:xfrm>
                       <a:off x="0" y="0"/>
-                      <a:ext cx="0" cy="4476750"/>
+                      <a:ext cx="2809875" cy="6096000"/>
                     </a:xfrm>
                     <a:prstGeom prst="rect">
                       <a:avLst/>
@@ -3248,7 +3248,7 @@
       <w:r>
         <w:drawing>
           <wp:inline distT="0" distB="0" distL="0" distR="0">
-            <wp:extent cx="0" cy="4476750"/>
+            <wp:extent cx="2809875" cy="6096000"/>
             <wp:effectExtent t="0" r="0" b="0" l="0"/>
             <wp:docPr id="1" name="" descr="" title=""/>
             <wp:cNvGraphicFramePr>
@@ -3273,7 +3273,7 @@
                   <pic:spPr bwMode="auto">
                     <a:xfrm>
                       <a:off x="0" y="0"/>
-                      <a:ext cx="0" cy="4476750"/>
+                      <a:ext cx="2809875" cy="6096000"/>
                     </a:xfrm>
                     <a:prstGeom prst="rect">
                       <a:avLst/>
@@ -3310,7 +3310,7 @@
       <w:r>
         <w:drawing>
           <wp:inline distT="0" distB="0" distL="0" distR="0">
-            <wp:extent cx="0" cy="4476750"/>
+            <wp:extent cx="2809875" cy="6096000"/>
             <wp:effectExtent t="0" r="0" b="0" l="0"/>
             <wp:docPr id="1" name="" descr="" title=""/>
             <wp:cNvGraphicFramePr>
@@ -3335,7 +3335,7 @@
                   <pic:spPr bwMode="auto">
                     <a:xfrm>
                       <a:off x="0" y="0"/>
-                      <a:ext cx="0" cy="4476750"/>
+                      <a:ext cx="2809875" cy="6096000"/>
                     </a:xfrm>
                     <a:prstGeom prst="rect">
                       <a:avLst/>
@@ -3472,7 +3472,7 @@
       <w:r>
         <w:drawing>
           <wp:inline distT="0" distB="0" distL="0" distR="0">
-            <wp:extent cx="0" cy="4476750"/>
+            <wp:extent cx="2809875" cy="6096000"/>
             <wp:effectExtent t="0" r="0" b="0" l="0"/>
             <wp:docPr id="1" name="" descr="" title=""/>
             <wp:cNvGraphicFramePr>
@@ -3497,7 +3497,7 @@
                   <pic:spPr bwMode="auto">
                     <a:xfrm>
                       <a:off x="0" y="0"/>
-                      <a:ext cx="0" cy="4476750"/>
+                      <a:ext cx="2809875" cy="6096000"/>
                     </a:xfrm>
                     <a:prstGeom prst="rect">
                       <a:avLst/>

</xml_diff>